<commit_message>
refactor(science): simplify Section B descriptive answers for 7th class students
</commit_message>
<xml_diff>
--- a/SA1_Science_Master_Solutions.docx
+++ b/SA1_Science_Master_Solutions.docx
@@ -2090,7 +2090,17 @@
                 <w:color w:val="334155"/>
                 <w:sz w:val="19"/>
               </w:rPr>
-              <w:t>**Answer:** Oxygen acts as an essential supporter of combustion; it chemically combines with the fuel at ignition temperature to sustain the oxidation reaction that releases heat and light.</w:t>
+              <w:t>**Answer:** Oxygen is needed for burning. It helps the fuel catch fire and keeps the flame burning.</w:t>
+              <w:br/>
+            </w:r>
+            <w:r>
+              <w:rPr>
+                <w:rFonts w:ascii="Segoe UI" w:hAnsi="Segoe UI"/>
+                <w:b/>
+                <w:color w:val="334155"/>
+                <w:sz w:val="19"/>
+              </w:rPr>
+              <w:t>- **తెలుగు వివరణ:** ఆక్సిజన్ దహనానికి (మండటానికి) సహాయపడుతుంది. ఆక్సిజన్ లేకపోతే ఏ వస్తువూ మండదు.</w:t>
               <w:br/>
             </w:r>
           </w:p>
@@ -2159,7 +2169,17 @@
                 <w:color w:val="334155"/>
                 <w:sz w:val="19"/>
               </w:rPr>
-              <w:t>**Answer:** Crystallisation is the physical process of obtaining pure, geometric solid crystals from a hot, saturated solution upon cooling or evaporation.</w:t>
+              <w:t>**Answer:** Crystallisation is the process of getting pure, solid crystals from a liquid solution when it cools down or evaporates.</w:t>
+              <w:br/>
+            </w:r>
+            <w:r>
+              <w:rPr>
+                <w:rFonts w:ascii="Segoe UI" w:hAnsi="Segoe UI"/>
+                <w:b/>
+                <w:color w:val="334155"/>
+                <w:sz w:val="19"/>
+              </w:rPr>
+              <w:t>- **తెలుగు వివరణ:** ఒక ద్రావణం చల్లబడినప్పుడు లేదా ఆవిరైనప్పుడు దాని నుండి స్వచ్ఛమైన స్పటికాలను పొందే పద్ధతిని స్పటికీకరణ అంటారు.</w:t>
               <w:br/>
             </w:r>
           </w:p>
@@ -2228,7 +2248,17 @@
                 <w:color w:val="334155"/>
                 <w:sz w:val="19"/>
               </w:rPr>
-              <w:t>**Answer:** Rusting occurs when iron metal is exposed simultaneously to atmospheric oxygen and water/moisture, forming reddish-brown hydrated ferric oxide (Fe₂O₃·xH₂O).</w:t>
+              <w:t>**Answer:** Rusting occurs when iron reacts with both oxygen (air) and moisture (water) to form a brown powdery substance called rust.</w:t>
+              <w:br/>
+            </w:r>
+            <w:r>
+              <w:rPr>
+                <w:rFonts w:ascii="Segoe UI" w:hAnsi="Segoe UI"/>
+                <w:b/>
+                <w:color w:val="334155"/>
+                <w:sz w:val="19"/>
+              </w:rPr>
+              <w:t>- **తెలుగు వివరణ:** ఇనుము గాలిలోని ఆక్సిజన్ మరియు తేమతో చర్య జరిపినప్పుడు గోధుమ రంగు తుప్పు ఏర్పడుతుంది.</w:t>
               <w:br/>
             </w:r>
           </w:p>
@@ -2297,7 +2327,17 @@
                 <w:color w:val="334155"/>
                 <w:sz w:val="19"/>
               </w:rPr>
-              <w:t>**Answer:** Both are **physical changes** because they only involve reversible changes in the physical state of matter (solid \rightleftharpoons liquid \rightleftharpoons gas); the chemical formula remains H₂O and no new substance is formed.</w:t>
+              <w:t>**Answer:** Both are **physical changes** because only the form changes (liquid to solid or gas). No new substance is formed, and ice can melt back into water.</w:t>
+              <w:br/>
+            </w:r>
+            <w:r>
+              <w:rPr>
+                <w:rFonts w:ascii="Segoe UI" w:hAnsi="Segoe UI"/>
+                <w:b/>
+                <w:color w:val="334155"/>
+                <w:sz w:val="19"/>
+              </w:rPr>
+              <w:t>- **తెలుగు వివరణ:** నీరు మంచుగా లేదా ఆవిరిగా మారడం **భౌతిక మార్పు**. ఎందుకంటే ఇందులో కొత్త పదార్థం ఏదీ ఏర్పడదు; మంచును వేడి చేస్తే మళ్లీ నీరు వస్తుంది.</w:t>
               <w:br/>
             </w:r>
           </w:p>
@@ -2366,7 +2406,17 @@
                 <w:color w:val="334155"/>
                 <w:sz w:val="19"/>
               </w:rPr>
-              <w:t>**Answer:** Curdling of milk is a **chemical change** because lactic acid bacteria (Lactobacillus) convert lactose sugar into lactic acid, permanently coagulating milk proteins into curd, which cannot be reversed back into milk.</w:t>
+              <w:t>**Answer:** Curdling of milk is a **chemical change** because a new substance (curd) with a sour taste is formed, and curd cannot be turned back into milk.</w:t>
+              <w:br/>
+            </w:r>
+            <w:r>
+              <w:rPr>
+                <w:rFonts w:ascii="Segoe UI" w:hAnsi="Segoe UI"/>
+                <w:b/>
+                <w:color w:val="334155"/>
+                <w:sz w:val="19"/>
+              </w:rPr>
+              <w:t>- **తెలుగు వివరణ:** పాలు పెరుగుగా మారడం **రసాయనిక మార్పు**. ఎందుకంటే ఇందులో పెరుగు అనే సరికొత్త పదార్థం ఏర్పడుతుంది మరియు పెరుగును మళ్లీ పాలుగా మార్చలేము.</w:t>
               <w:br/>
             </w:r>
           </w:p>
@@ -2397,7 +2447,7 @@
           <w:color w:val="0F766E"/>
           <w:sz w:val="22"/>
         </w:rPr>
-        <w:t>Section B: Answer the following questions briefly in three to four sentences:</w:t>
+        <w:t>Section B: Answer the following questions briefly in three to four sentences (Kid-Friendly &amp; Exam-Ready):</w:t>
       </w:r>
     </w:p>
     <w:p>
@@ -2467,11 +2517,37 @@
             <w:r>
               <w:rPr>
                 <w:rFonts w:ascii="Segoe UI" w:hAnsi="Segoe UI"/>
-                <w:b/>
                 <w:color w:val="334155"/>
                 <w:sz w:val="19"/>
               </w:rPr>
-              <w:t>- In a **physical change**, only physical attributes (size, shape, state) change; no new chemical substance is formed, and the change is usually reversible (e.g., melting ice).</w:t>
+              <w:t>1. In a **physical change**, no new substance is formed (e.g., melting of ice or tearing paper).</w:t>
+              <w:br/>
+            </w:r>
+            <w:r>
+              <w:rPr>
+                <w:rFonts w:ascii="Segoe UI" w:hAnsi="Segoe UI"/>
+                <w:color w:val="334155"/>
+                <w:sz w:val="19"/>
+              </w:rPr>
+              <w:t>2. It only changes the shape, size, or state of matter, and it is usually reversible.</w:t>
+              <w:br/>
+            </w:r>
+            <w:r>
+              <w:rPr>
+                <w:rFonts w:ascii="Segoe UI" w:hAnsi="Segoe UI"/>
+                <w:color w:val="334155"/>
+                <w:sz w:val="19"/>
+              </w:rPr>
+              <w:t>3. In a **chemical change**, an entirely new substance is formed with new properties (e.g., burning wood or cooking food).</w:t>
+              <w:br/>
+            </w:r>
+            <w:r>
+              <w:rPr>
+                <w:rFonts w:ascii="Segoe UI" w:hAnsi="Segoe UI"/>
+                <w:color w:val="334155"/>
+                <w:sz w:val="19"/>
+              </w:rPr>
+              <w:t>4. Chemical changes are permanent and cannot be reversed easily.</w:t>
               <w:br/>
             </w:r>
             <w:r>
@@ -2481,319 +2557,7 @@
                 <w:color w:val="334155"/>
                 <w:sz w:val="19"/>
               </w:rPr>
-              <w:t>- In a **chemical change**, one or more entirely new substances with distinct chemical properties are formed, chemical bonds are altered, and the change is permanent and irreversible (e.g., burning wood).</w:t>
-              <w:br/>
-            </w:r>
-          </w:p>
-        </w:tc>
-      </w:tr>
-    </w:tbl>
-    <w:p/>
-    <w:p>
-      <w:pPr>
-        <w:spacing w:before="40" w:after="40" w:line="276" w:lineRule="auto"/>
-      </w:pPr>
-      <w:r>
-        <w:rPr>
-          <w:rFonts w:ascii="Segoe UI" w:hAnsi="Segoe UI"/>
-          <w:color w:val="1E293B"/>
-          <w:sz w:val="20"/>
-        </w:rPr>
-        <w:t>**Q2. What are the signs that a chemical change has occurred?**</w:t>
-      </w:r>
-    </w:p>
-    <w:tbl>
-      <w:tblPr>
-        <w:tblW w:type="auto" w:w="0"/>
-        <w:jc w:val="center"/>
-        <w:tblLayout w:type="fixed"/>
-        <w:tblLook w:firstColumn="1" w:firstRow="1" w:lastColumn="0" w:lastRow="0" w:noHBand="0" w:noVBand="1" w:val="04A0"/>
-      </w:tblPr>
-      <w:tblGrid>
-        <w:gridCol w:w="10080"/>
-      </w:tblGrid>
-      <w:tr>
-        <w:tc>
-          <w:tcPr>
-            <w:tcW w:type="dxa" w:w="9360"/>
-            <w:shd w:fill="F0F9FF"/>
-            <w:tcMar>
-              <w:top w:w="120" w:type="dxa"/>
-              <w:bottom w:w="120" w:type="dxa"/>
-              <w:left w:w="180" w:type="dxa"/>
-              <w:right w:w="140" w:type="dxa"/>
-            </w:tcMar>
-            <w:tcBorders>
-              <w:top w:val="none"/>
-              <w:left w:val="single" w:sz="24" w:space="0" w:color="0284C7"/>
-              <w:bottom w:val="none"/>
-              <w:right w:val="none"/>
-            </w:tcBorders>
-          </w:tcPr>
-          <w:p>
-            <w:pPr>
-              <w:spacing w:before="40" w:after="40" w:line="276" w:lineRule="auto"/>
-            </w:pPr>
-            <w:r>
-              <w:rPr>
-                <w:rFonts w:ascii="Segoe UI" w:hAnsi="Segoe UI"/>
-                <w:b/>
-                <w:color w:val="1E3A8A"/>
-                <w:sz w:val="20"/>
-              </w:rPr>
-              <w:t>Curriculum Overview / Key Scientific Fact</w:t>
-              <w:br/>
-            </w:r>
-            <w:r>
-              <w:rPr>
-                <w:rFonts w:ascii="Segoe UI" w:hAnsi="Segoe UI"/>
-                <w:color w:val="334155"/>
-                <w:sz w:val="19"/>
-              </w:rPr>
-              <w:t>**Answer:** The key observable signs of a chemical change include:</w:t>
-              <w:br/>
-            </w:r>
-            <w:r>
-              <w:rPr>
-                <w:rFonts w:ascii="Segoe UI" w:hAnsi="Segoe UI"/>
-                <w:color w:val="334155"/>
-                <w:sz w:val="19"/>
-              </w:rPr>
-              <w:t>1. Evolution of a gas (effervescence or bubbling).</w:t>
-              <w:br/>
-            </w:r>
-            <w:r>
-              <w:rPr>
-                <w:rFonts w:ascii="Segoe UI" w:hAnsi="Segoe UI"/>
-                <w:color w:val="334155"/>
-                <w:sz w:val="19"/>
-              </w:rPr>
-              <w:t>2. Change in colour (e.g., copper sulphate changing from blue to green when iron is added).</w:t>
-              <w:br/>
-            </w:r>
-            <w:r>
-              <w:rPr>
-                <w:rFonts w:ascii="Segoe UI" w:hAnsi="Segoe UI"/>
-                <w:color w:val="334155"/>
-                <w:sz w:val="19"/>
-              </w:rPr>
-              <w:t>3. Production or absorption of heat and light (temperature change).</w:t>
-              <w:br/>
-            </w:r>
-            <w:r>
-              <w:rPr>
-                <w:rFonts w:ascii="Segoe UI" w:hAnsi="Segoe UI"/>
-                <w:color w:val="334155"/>
-                <w:sz w:val="19"/>
-              </w:rPr>
-              <w:t>4. Formation of an insoluble precipitate or change in smell/odour.</w:t>
-              <w:br/>
-            </w:r>
-          </w:p>
-        </w:tc>
-      </w:tr>
-    </w:tbl>
-    <w:p/>
-    <w:p>
-      <w:pPr>
-        <w:spacing w:before="40" w:after="40" w:line="276" w:lineRule="auto"/>
-      </w:pPr>
-      <w:r>
-        <w:rPr>
-          <w:rFonts w:ascii="Segoe UI" w:hAnsi="Segoe UI"/>
-          <w:color w:val="1E293B"/>
-          <w:sz w:val="20"/>
-        </w:rPr>
-        <w:t>**Q3. What role does heat play in combustion?**</w:t>
-      </w:r>
-    </w:p>
-    <w:tbl>
-      <w:tblPr>
-        <w:tblW w:type="auto" w:w="0"/>
-        <w:jc w:val="center"/>
-        <w:tblLayout w:type="fixed"/>
-        <w:tblLook w:firstColumn="1" w:firstRow="1" w:lastColumn="0" w:lastRow="0" w:noHBand="0" w:noVBand="1" w:val="04A0"/>
-      </w:tblPr>
-      <w:tblGrid>
-        <w:gridCol w:w="10080"/>
-      </w:tblGrid>
-      <w:tr>
-        <w:tc>
-          <w:tcPr>
-            <w:tcW w:type="dxa" w:w="9360"/>
-            <w:shd w:fill="F0F9FF"/>
-            <w:tcMar>
-              <w:top w:w="120" w:type="dxa"/>
-              <w:bottom w:w="120" w:type="dxa"/>
-              <w:left w:w="180" w:type="dxa"/>
-              <w:right w:w="140" w:type="dxa"/>
-            </w:tcMar>
-            <w:tcBorders>
-              <w:top w:val="none"/>
-              <w:left w:val="single" w:sz="24" w:space="0" w:color="0284C7"/>
-              <w:bottom w:val="none"/>
-              <w:right w:val="none"/>
-            </w:tcBorders>
-          </w:tcPr>
-          <w:p>
-            <w:pPr>
-              <w:spacing w:before="40" w:after="40" w:line="276" w:lineRule="auto"/>
-            </w:pPr>
-            <w:r>
-              <w:rPr>
-                <w:rFonts w:ascii="Segoe UI" w:hAnsi="Segoe UI"/>
-                <w:b/>
-                <w:color w:val="1E3A8A"/>
-                <w:sz w:val="20"/>
-              </w:rPr>
-              <w:t>Curriculum Overview / Key Scientific Fact</w:t>
-              <w:br/>
-            </w:r>
-            <w:r>
-              <w:rPr>
-                <w:rFonts w:ascii="Segoe UI" w:hAnsi="Segoe UI"/>
-                <w:color w:val="334155"/>
-                <w:sz w:val="19"/>
-              </w:rPr>
-              <w:t>**Answer:** Heat provides the necessary activation energy to raise the temperature of the combustible fuel to its **ignition temperature** (the lowest temperature at which a substance catches fire). Once ignition temperature is attained, the exothermic reaction becomes self-sustaining as long as fuel and oxygen are supplied.</w:t>
-              <w:br/>
-            </w:r>
-          </w:p>
-        </w:tc>
-      </w:tr>
-    </w:tbl>
-    <w:p/>
-    <w:p>
-      <w:pPr>
-        <w:spacing w:before="40" w:after="40" w:line="276" w:lineRule="auto"/>
-      </w:pPr>
-      <w:r>
-        <w:rPr>
-          <w:rFonts w:ascii="Segoe UI" w:hAnsi="Segoe UI"/>
-          <w:color w:val="1E293B"/>
-          <w:sz w:val="20"/>
-        </w:rPr>
-        <w:t>**Q4. How does crystallisation occur in nature or industry?**</w:t>
-      </w:r>
-    </w:p>
-    <w:tbl>
-      <w:tblPr>
-        <w:tblW w:type="auto" w:w="0"/>
-        <w:jc w:val="center"/>
-        <w:tblLayout w:type="fixed"/>
-        <w:tblLook w:firstColumn="1" w:firstRow="1" w:lastColumn="0" w:lastRow="0" w:noHBand="0" w:noVBand="1" w:val="04A0"/>
-      </w:tblPr>
-      <w:tblGrid>
-        <w:gridCol w:w="10080"/>
-      </w:tblGrid>
-      <w:tr>
-        <w:tc>
-          <w:tcPr>
-            <w:tcW w:type="dxa" w:w="9360"/>
-            <w:shd w:fill="F0F9FF"/>
-            <w:tcMar>
-              <w:top w:w="120" w:type="dxa"/>
-              <w:bottom w:w="120" w:type="dxa"/>
-              <w:left w:w="180" w:type="dxa"/>
-              <w:right w:w="140" w:type="dxa"/>
-            </w:tcMar>
-            <w:tcBorders>
-              <w:top w:val="none"/>
-              <w:left w:val="single" w:sz="24" w:space="0" w:color="0284C7"/>
-              <w:bottom w:val="none"/>
-              <w:right w:val="none"/>
-            </w:tcBorders>
-          </w:tcPr>
-          <w:p>
-            <w:pPr>
-              <w:spacing w:before="40" w:after="40" w:line="276" w:lineRule="auto"/>
-            </w:pPr>
-            <w:r>
-              <w:rPr>
-                <w:rFonts w:ascii="Segoe UI" w:hAnsi="Segoe UI"/>
-                <w:b/>
-                <w:color w:val="1E3A8A"/>
-                <w:sz w:val="20"/>
-              </w:rPr>
-              <w:t>Curriculum Overview / Key Scientific Fact</w:t>
-              <w:br/>
-            </w:r>
-            <w:r>
-              <w:rPr>
-                <w:rFonts w:ascii="Segoe UI" w:hAnsi="Segoe UI"/>
-                <w:color w:val="334155"/>
-                <w:sz w:val="19"/>
-              </w:rPr>
-              <w:t>**Answer:** In nature, crystallisation occurs when mineral-rich hot magma cools slowly deep within the Earth or when seawater evaporates in shallow lagoons forming common salt beds. In industry, it is widely used to purify pharmaceuticals, extract refined table sugar from sugarcane juice, and manufacture pure copper sulphate crystals.</w:t>
-              <w:br/>
-            </w:r>
-          </w:p>
-        </w:tc>
-      </w:tr>
-    </w:tbl>
-    <w:p/>
-    <w:p>
-      <w:pPr>
-        <w:spacing w:before="40" w:after="40" w:line="276" w:lineRule="auto"/>
-      </w:pPr>
-      <w:r>
-        <w:rPr>
-          <w:rFonts w:ascii="Segoe UI" w:hAnsi="Segoe UI"/>
-          <w:color w:val="1E293B"/>
-          <w:sz w:val="20"/>
-        </w:rPr>
-        <w:t>**Q5. Natural factors, such as wind, rain, etc., help in the formation of soil from rocks. Is this change physical or chemical and why? [NCERT]**</w:t>
-      </w:r>
-    </w:p>
-    <w:tbl>
-      <w:tblPr>
-        <w:tblW w:type="auto" w:w="0"/>
-        <w:jc w:val="center"/>
-        <w:tblLayout w:type="fixed"/>
-        <w:tblLook w:firstColumn="1" w:firstRow="1" w:lastColumn="0" w:lastRow="0" w:noHBand="0" w:noVBand="1" w:val="04A0"/>
-      </w:tblPr>
-      <w:tblGrid>
-        <w:gridCol w:w="10080"/>
-      </w:tblGrid>
-      <w:tr>
-        <w:tc>
-          <w:tcPr>
-            <w:tcW w:type="dxa" w:w="9360"/>
-            <w:shd w:fill="F0F9FF"/>
-            <w:tcMar>
-              <w:top w:w="120" w:type="dxa"/>
-              <w:bottom w:w="120" w:type="dxa"/>
-              <w:left w:w="180" w:type="dxa"/>
-              <w:right w:w="140" w:type="dxa"/>
-            </w:tcMar>
-            <w:tcBorders>
-              <w:top w:val="none"/>
-              <w:left w:val="single" w:sz="24" w:space="0" w:color="0284C7"/>
-              <w:bottom w:val="none"/>
-              <w:right w:val="none"/>
-            </w:tcBorders>
-          </w:tcPr>
-          <w:p>
-            <w:pPr>
-              <w:spacing w:before="40" w:after="40" w:line="276" w:lineRule="auto"/>
-            </w:pPr>
-            <w:r>
-              <w:rPr>
-                <w:rFonts w:ascii="Segoe UI" w:hAnsi="Segoe UI"/>
-                <w:b/>
-                <w:color w:val="1E3A8A"/>
-                <w:sz w:val="20"/>
-              </w:rPr>
-              <w:t>Curriculum Overview / Key Scientific Fact</w:t>
-              <w:br/>
-            </w:r>
-            <w:r>
-              <w:rPr>
-                <w:rFonts w:ascii="Segoe UI" w:hAnsi="Segoe UI"/>
-                <w:color w:val="334155"/>
-                <w:sz w:val="19"/>
-              </w:rPr>
-              <w:t>**Answer:** Formation of soil involves **both physical and chemical weathering**:</w:t>
+              <w:t>- **తెలుగు వివరణ:**</w:t>
               <w:br/>
             </w:r>
             <w:r>
@@ -2803,7 +2567,7 @@
                 <w:color w:val="334155"/>
                 <w:sz w:val="19"/>
               </w:rPr>
-              <w:t>- *Physical weathering:* Wind, freezing water, and temperature fluctuations physically crack and break large rocks into smaller mineral grains without changing chemical composition.</w:t>
+              <w:t>- **భౌతిక మార్పు:** కొత్త పదార్థం ఏదీ ఏర్పడదు (ఉదా: మంచు కరగడం). ఇది తాత్కాలికమైనది మరియు వెనక్కి తిప్పవచ్చు.</w:t>
               <w:br/>
             </w:r>
             <w:r>
@@ -2813,7 +2577,7 @@
                 <w:color w:val="334155"/>
                 <w:sz w:val="19"/>
               </w:rPr>
-              <w:t>- *Chemical weathering:* Rainwater containing dissolved atmospheric gases (CO₂, acid rain) reacts chemically with rock minerals, breaking them down into new clay minerals and soluble salts.</w:t>
+              <w:t>- **రసాయనిక మార్పు:** సరికొత్త పదార్థం ఏర్పడుతుంది (ఉదా: కలప మండడం). ఇది శాశ్వతమైనది మరియు వెనక్కి మార్చలేము.</w:t>
               <w:br/>
             </w:r>
           </w:p>
@@ -2823,32 +2587,6 @@
     <w:p/>
     <w:p>
       <w:pPr>
-        <w:spacing w:before="80" w:after="80"/>
-      </w:pPr>
-      <w:r>
-        <w:rPr>
-          <w:color w:val="CBD5E1"/>
-          <w:sz w:val="16"/>
-        </w:rPr>
-        <w:t>_______________________________________________________________________________</w:t>
-      </w:r>
-    </w:p>
-    <w:p>
-      <w:pPr>
-        <w:spacing w:before="200" w:after="60"/>
-      </w:pPr>
-      <w:r>
-        <w:rPr>
-          <w:rFonts w:ascii="Segoe UI" w:hAnsi="Segoe UI"/>
-          <w:b/>
-          <w:color w:val="0F766E"/>
-          <w:sz w:val="22"/>
-        </w:rPr>
-        <w:t>Section C: Answer the following questions in five to seven complete sentences:</w:t>
-      </w:r>
-    </w:p>
-    <w:p>
-      <w:pPr>
         <w:spacing w:before="40" w:after="40" w:line="276" w:lineRule="auto"/>
       </w:pPr>
       <w:r>
@@ -2857,7 +2595,7 @@
           <w:color w:val="1E293B"/>
           <w:sz w:val="20"/>
         </w:rPr>
-        <w:t>**Q1. Describe the steps involved in combustion with an example.**</w:t>
+        <w:t>**Q2. What are the signs that a chemical change has occurred?**</w:t>
       </w:r>
     </w:p>
     <w:tbl>
@@ -2917,7 +2655,7 @@
                 <w:color w:val="334155"/>
                 <w:sz w:val="19"/>
               </w:rPr>
-              <w:t>1. **Availability of Fuel &amp; Supporter:** Combustible fuel (e.g., a candle wick saturated with wax or magnesium ribbon) is placed in contact with atmospheric oxygen.</w:t>
+              <w:t>We can tell a chemical change has happened by observing these simple signs:</w:t>
               <w:br/>
             </w:r>
             <w:r>
@@ -2926,7 +2664,7 @@
                 <w:color w:val="334155"/>
                 <w:sz w:val="19"/>
               </w:rPr>
-              <w:t>2. **Application of Heat:** An external heat source (e.g., a matchstick flame) heats the fuel until it reaches its specific ignition temperature.</w:t>
+              <w:t>1. **Gas bubbles or fizzing** are produced (e.g., baking soda mixed with vinegar).</w:t>
               <w:br/>
             </w:r>
             <w:r>
@@ -2935,7 +2673,7 @@
                 <w:color w:val="334155"/>
                 <w:sz w:val="19"/>
               </w:rPr>
-              <w:t>3. **Vaporisation &amp; Oxidation:** The fuel vaporises and reacts vigorously with oxygen molecules in an exothermic reaction.</w:t>
+              <w:t>2. **Change in colour** takes place (e.g., an iron nail turning reddish-brown).</w:t>
               <w:br/>
             </w:r>
             <w:r>
@@ -2944,7 +2682,7 @@
                 <w:color w:val="334155"/>
                 <w:sz w:val="19"/>
               </w:rPr>
-              <w:t>4. **Energy Release:** Chemical potential energy is transformed into radiant energy, emitting visible light and thermal energy (heat).</w:t>
+              <w:t>3. **Heat or light** is given off or taken in (e.g., a matchstick burning).</w:t>
               <w:br/>
             </w:r>
             <w:r>
@@ -2953,76 +2691,7 @@
                 <w:color w:val="334155"/>
                 <w:sz w:val="19"/>
               </w:rPr>
-              <w:t>5. **Formation of By-products:** New chemical compounds are formed, such as carbon dioxide (CO₂), water vapour (H₂O), and ash residues. For example, burning magnesium: 2Mg + O₂ → 2MgO with dazzling white brilliance.</w:t>
-              <w:br/>
-            </w:r>
-          </w:p>
-        </w:tc>
-      </w:tr>
-    </w:tbl>
-    <w:p/>
-    <w:p>
-      <w:pPr>
-        <w:spacing w:before="40" w:after="40" w:line="276" w:lineRule="auto"/>
-      </w:pPr>
-      <w:r>
-        <w:rPr>
-          <w:rFonts w:ascii="Segoe UI" w:hAnsi="Segoe UI"/>
-          <w:color w:val="1E293B"/>
-          <w:sz w:val="20"/>
-        </w:rPr>
-        <w:t>**Q2. How does rusting weaken iron? What methods can prevent it?**</w:t>
-      </w:r>
-    </w:p>
-    <w:tbl>
-      <w:tblPr>
-        <w:tblW w:type="auto" w:w="0"/>
-        <w:jc w:val="center"/>
-        <w:tblLayout w:type="fixed"/>
-        <w:tblLook w:firstColumn="1" w:firstRow="1" w:lastColumn="0" w:lastRow="0" w:noHBand="0" w:noVBand="1" w:val="04A0"/>
-      </w:tblPr>
-      <w:tblGrid>
-        <w:gridCol w:w="10080"/>
-      </w:tblGrid>
-      <w:tr>
-        <w:tc>
-          <w:tcPr>
-            <w:tcW w:type="dxa" w:w="9360"/>
-            <w:shd w:fill="F0F9FF"/>
-            <w:tcMar>
-              <w:top w:w="120" w:type="dxa"/>
-              <w:bottom w:w="120" w:type="dxa"/>
-              <w:left w:w="180" w:type="dxa"/>
-              <w:right w:w="140" w:type="dxa"/>
-            </w:tcMar>
-            <w:tcBorders>
-              <w:top w:val="none"/>
-              <w:left w:val="single" w:sz="24" w:space="0" w:color="0284C7"/>
-              <w:bottom w:val="none"/>
-              <w:right w:val="none"/>
-            </w:tcBorders>
-          </w:tcPr>
-          <w:p>
-            <w:pPr>
-              <w:spacing w:before="40" w:after="40" w:line="276" w:lineRule="auto"/>
-            </w:pPr>
-            <w:r>
-              <w:rPr>
-                <w:rFonts w:ascii="Segoe UI" w:hAnsi="Segoe UI"/>
-                <w:b/>
-                <w:color w:val="1E3A8A"/>
-                <w:sz w:val="20"/>
-              </w:rPr>
-              <w:t>Curriculum Overview / Key Scientific Fact</w:t>
-              <w:br/>
-            </w:r>
-            <w:r>
-              <w:rPr>
-                <w:rFonts w:ascii="Segoe UI" w:hAnsi="Segoe UI"/>
-                <w:color w:val="334155"/>
-                <w:sz w:val="19"/>
-              </w:rPr>
-              <w:t>**Answer:**</w:t>
+              <w:t>4. A **new smell** appears or an insoluble solid (precipitate) is formed.</w:t>
               <w:br/>
             </w:r>
             <w:r>
@@ -3032,7 +2701,7 @@
                 <w:color w:val="334155"/>
                 <w:sz w:val="19"/>
               </w:rPr>
-              <w:t>- Rusting converts strong, tough metallic iron into hydrated ferric oxide (Fe₂O₃·xH₂O), which is a porous, brittle, and flaky powder.</w:t>
+              <w:t>- **తెలుగు వివరణ:**</w:t>
               <w:br/>
             </w:r>
             <w:r>
@@ -3042,53 +2711,7 @@
                 <w:color w:val="334155"/>
                 <w:sz w:val="19"/>
               </w:rPr>
-              <w:t>- As rust flakes off, the underlying fresh iron layer is repeatedly exposed to moist air, causing continuous progressive erosion that weakens structural strength of bridges, ships, railway tracks, and buildings.</w:t>
-              <w:br/>
-            </w:r>
-            <w:r>
-              <w:rPr>
-                <w:rFonts w:ascii="Segoe UI" w:hAnsi="Segoe UI"/>
-                <w:b/>
-                <w:color w:val="334155"/>
-                <w:sz w:val="19"/>
-              </w:rPr>
-              <w:t>- **Methods of Prevention:**</w:t>
-              <w:br/>
-            </w:r>
-            <w:r>
-              <w:rPr>
-                <w:rFonts w:ascii="Segoe UI" w:hAnsi="Segoe UI"/>
-                <w:color w:val="334155"/>
-                <w:sz w:val="19"/>
-              </w:rPr>
-              <w:t>1. **Barrier Protection (Painting/Greasing):** Applying a coat of paint, grease, or oil shields iron surfaces from direct contact with air and moisture.</w:t>
-              <w:br/>
-            </w:r>
-            <w:r>
-              <w:rPr>
-                <w:rFonts w:ascii="Segoe UI" w:hAnsi="Segoe UI"/>
-                <w:color w:val="334155"/>
-                <w:sz w:val="19"/>
-              </w:rPr>
-              <w:t>2. **Galvanisation:** Depositing a protective sacrificial coating of zinc metal over iron; zinc corrodes sacrificially to preserve the iron underneath.</w:t>
-              <w:br/>
-            </w:r>
-            <w:r>
-              <w:rPr>
-                <w:rFonts w:ascii="Segoe UI" w:hAnsi="Segoe UI"/>
-                <w:color w:val="334155"/>
-                <w:sz w:val="19"/>
-              </w:rPr>
-              <w:t>3. **Electroplating:** Coating iron with non-corrosive metals like chromium or nickel.</w:t>
-              <w:br/>
-            </w:r>
-            <w:r>
-              <w:rPr>
-                <w:rFonts w:ascii="Segoe UI" w:hAnsi="Segoe UI"/>
-                <w:color w:val="334155"/>
-                <w:sz w:val="19"/>
-              </w:rPr>
-              <w:t>4. **Alloying:** Melting iron with carbon, chromium, and nickel to manufacture **Stainless Steel**, which does not rust.</w:t>
+              <w:t>- రసాయనిక మార్పు జరిగినప్పుడు వాయువు బుడగలు రావడం, రంగు మారడం, ఉష్ణం లేదా వెలుగు రావడం మరియు కొత్త వాసన రావడం వంటి గుర్తులు కనిపిస్తాయి.</w:t>
               <w:br/>
             </w:r>
           </w:p>
@@ -3106,7 +2729,7 @@
           <w:color w:val="1E293B"/>
           <w:sz w:val="20"/>
         </w:rPr>
-        <w:t>**Q3. Explain different types of changes that happen around us.**</w:t>
+        <w:t>**Q3. What role does heat play in combustion?**</w:t>
       </w:r>
     </w:p>
     <w:tbl>
@@ -3166,7 +2789,7 @@
                 <w:color w:val="334155"/>
                 <w:sz w:val="19"/>
               </w:rPr>
-              <w:t>1. **Physical Changes:** Changes affecting only state, size, or shape without forming new substances (e.g., tearing paper, boiling water).</w:t>
+              <w:t>1. Heat warms up the fuel to its **ignition temperature** (the minimum heat needed to catch fire).</w:t>
               <w:br/>
             </w:r>
             <w:r>
@@ -3175,7 +2798,7 @@
                 <w:color w:val="334155"/>
                 <w:sz w:val="19"/>
               </w:rPr>
-              <w:t>2. **Chemical Changes:** Changes resulting in the formation of new substances with distinct identities (e.g., curdling milk, rusting iron).</w:t>
+              <w:t>2. Without heat, a substance cannot start burning, even if air is present.</w:t>
               <w:br/>
             </w:r>
             <w:r>
@@ -3184,34 +2807,27 @@
                 <w:color w:val="334155"/>
                 <w:sz w:val="19"/>
               </w:rPr>
-              <w:t>3. **Reversible Changes:** Changes that can be undone to obtain original materials (e.g., stretching a rubber band, freezing water).</w:t>
+              <w:t>3. Once burning begins, the reaction produces its own heat to keep the fire going.</w:t>
               <w:br/>
             </w:r>
             <w:r>
               <w:rPr>
                 <w:rFonts w:ascii="Segoe UI" w:hAnsi="Segoe UI"/>
+                <w:b/>
                 <w:color w:val="334155"/>
                 <w:sz w:val="19"/>
               </w:rPr>
-              <w:t>4. **Irreversible Changes:** Changes that permanently alter matter and cannot be undone (e.g., burning paper, baking a cake).</w:t>
+              <w:t>- **తెలుగు వివరణ:**</w:t>
               <w:br/>
             </w:r>
             <w:r>
               <w:rPr>
                 <w:rFonts w:ascii="Segoe UI" w:hAnsi="Segoe UI"/>
+                <w:b/>
                 <w:color w:val="334155"/>
                 <w:sz w:val="19"/>
               </w:rPr>
-              <w:t>5. **Periodic vs Non-Periodic Changes:** Changes that repeat at regular intervals (phases of moon) versus irregular events (earthquakes).</w:t>
-              <w:br/>
-            </w:r>
-            <w:r>
-              <w:rPr>
-                <w:rFonts w:ascii="Segoe UI" w:hAnsi="Segoe UI"/>
-                <w:color w:val="334155"/>
-                <w:sz w:val="19"/>
-              </w:rPr>
-              <w:t>6. **Slow vs Fast Changes:** Changes taking months/years (rusting, weathering) versus instantaneous changes (fireworks explosion).</w:t>
+              <w:t>- ఏదైనా పదార్థం మండాలంటే దానికి తగినంత వేడి (జ్వలన ఉష్ణోగ్రత) అవసరం. వేడి లేకుండా నిప్పు రాజుకోదు. మండడం మొదలయ్యాక అది స్వయంగా వేడిని విడుదల చేస్తూ మండుతుంది.</w:t>
               <w:br/>
             </w:r>
           </w:p>
@@ -3229,7 +2845,7 @@
           <w:color w:val="1E293B"/>
           <w:sz w:val="20"/>
         </w:rPr>
-        <w:t>**Q4. Define reversible and irreversible changes with suitable examples.**</w:t>
+        <w:t>**Q4. How does crystallisation occur in nature or industry?**</w:t>
       </w:r>
     </w:p>
     <w:tbl>
@@ -3286,11 +2902,28 @@
             <w:r>
               <w:rPr>
                 <w:rFonts w:ascii="Segoe UI" w:hAnsi="Segoe UI"/>
-                <w:b/>
                 <w:color w:val="334155"/>
                 <w:sz w:val="19"/>
               </w:rPr>
-              <w:t>- **Reversible Changes:** A change in which the system can be restored back to its original state and form by reversing the conditions (such as temperature or pressure). Examples include:</w:t>
+              <w:t>1. **In Nature:** Seawater collects in shallow pits, and when the sun evaporates the water, pure common salt crystals are left behind.</w:t>
+              <w:br/>
+            </w:r>
+            <w:r>
+              <w:rPr>
+                <w:rFonts w:ascii="Segoe UI" w:hAnsi="Segoe UI"/>
+                <w:color w:val="334155"/>
+                <w:sz w:val="19"/>
+              </w:rPr>
+              <w:t>2. **In Industry:** Sugar mills cool down hot, concentrated sugarcane syrup to form clean sugar crystals.</w:t>
+              <w:br/>
+            </w:r>
+            <w:r>
+              <w:rPr>
+                <w:rFonts w:ascii="Segoe UI" w:hAnsi="Segoe UI"/>
+                <w:color w:val="334155"/>
+                <w:sz w:val="19"/>
+              </w:rPr>
+              <w:t>3. It is also used in science labs to obtain pure crystals of copper sulphate.</w:t>
               <w:br/>
             </w:r>
             <w:r>
@@ -3300,7 +2933,7 @@
                 <w:color w:val="334155"/>
                 <w:sz w:val="19"/>
               </w:rPr>
-              <w:t>- Melting of ice into water, which can be re-frozen into ice by lowering temperature.</w:t>
+              <w:t>- **తెలుగు వివరణ:**</w:t>
               <w:br/>
             </w:r>
             <w:r>
@@ -3310,57 +2943,7 @@
                 <w:color w:val="334155"/>
                 <w:sz w:val="19"/>
               </w:rPr>
-              <w:t>- Stretching a rubber band, which returns to its original length when the applied force is released.</w:t>
-              <w:br/>
-            </w:r>
-            <w:r>
-              <w:rPr>
-                <w:rFonts w:ascii="Segoe UI" w:hAnsi="Segoe UI"/>
-                <w:b/>
-                <w:color w:val="334155"/>
-                <w:sz w:val="19"/>
-              </w:rPr>
-              <w:t>- Dissolving sugar in water, where pure sugar crystals can be recovered through evaporation.</w:t>
-              <w:br/>
-            </w:r>
-            <w:r>
-              <w:rPr>
-                <w:rFonts w:ascii="Segoe UI" w:hAnsi="Segoe UI"/>
-                <w:b/>
-                <w:color w:val="334155"/>
-                <w:sz w:val="19"/>
-              </w:rPr>
-              <w:t>- **Irreversible Changes:** A change in which the original substance cannot be retrieved by any physical means once the transformation has occurred. Examples include:</w:t>
-              <w:br/>
-            </w:r>
-            <w:r>
-              <w:rPr>
-                <w:rFonts w:ascii="Segoe UI" w:hAnsi="Segoe UI"/>
-                <w:b/>
-                <w:color w:val="334155"/>
-                <w:sz w:val="19"/>
-              </w:rPr>
-              <w:t>- Burning of wood or paper, which yields ash and gases that cannot be reassembled into wood.</w:t>
-              <w:br/>
-            </w:r>
-            <w:r>
-              <w:rPr>
-                <w:rFonts w:ascii="Segoe UI" w:hAnsi="Segoe UI"/>
-                <w:b/>
-                <w:color w:val="334155"/>
-                <w:sz w:val="19"/>
-              </w:rPr>
-              <w:t>- Cooking or boiling an egg, where proteins permanently denature and coagulate.</w:t>
-              <w:br/>
-            </w:r>
-            <w:r>
-              <w:rPr>
-                <w:rFonts w:ascii="Segoe UI" w:hAnsi="Segoe UI"/>
-                <w:b/>
-                <w:color w:val="334155"/>
-                <w:sz w:val="19"/>
-              </w:rPr>
-              <w:t>- Rusting of iron into hydrated iron oxide.</w:t>
+              <w:t>- ప్రకృతిలో సముద్రపు నీరు ఎండకు ఆవిరైనప్పుడు ఉప్పు స్పటికాలు ఏర్పడతాయి. కర్మాగారాలలో వేడి చెరుకు రసాన్ని చల్లబరిచి స్వచ్ఛమైన పంచదార స్పటికాలను తయారుచేస్తారు.</w:t>
               <w:br/>
             </w:r>
           </w:p>
@@ -3378,7 +2961,7 @@
           <w:color w:val="1E293B"/>
           <w:sz w:val="20"/>
         </w:rPr>
-        <w:t>**Q5. Categorisation Question (Venn Diagram / Areas A, B, C):**</w:t>
+        <w:t>**Q5. Natural factors, such as wind, rain, etc., help in the formation of soil from rocks. Is this change physical or chemical and why? [NCERT]**</w:t>
       </w:r>
     </w:p>
     <w:tbl>
@@ -3429,7 +3012,7 @@
                 <w:color w:val="334155"/>
                 <w:sz w:val="19"/>
               </w:rPr>
-              <w:t>*Classify: Burning of a candle; Tearing of paper; Rusting; Curdling of milk; Ripening of fruits; Melting of ice; Folding of clothes; Burning of magnesium; Mixing baking soda with vinegar.*</w:t>
+              <w:t>**Answer:**</w:t>
               <w:br/>
             </w:r>
             <w:r>
@@ -3438,7 +3021,7 @@
                 <w:color w:val="334155"/>
                 <w:sz w:val="19"/>
               </w:rPr>
-              <w:t>| Category | Changes Included | Scientific Rationale |</w:t>
+              <w:t>Soil formation involves **both physical and chemical changes**:</w:t>
               <w:br/>
             </w:r>
             <w:r>
@@ -3447,7 +3030,7 @@
                 <w:color w:val="334155"/>
                 <w:sz w:val="19"/>
               </w:rPr>
-              <w:t>| :--- | :--- | :--- |</w:t>
+              <w:t>1. **Physical change:** Strong winds and rushing rainwater break large rocks into small sand grains without changing what they are made of.</w:t>
               <w:br/>
             </w:r>
             <w:r>
@@ -3456,25 +3039,37 @@
                 <w:color w:val="334155"/>
                 <w:sz w:val="19"/>
               </w:rPr>
-              <w:t>| **Area A: Physical Changes Only** | 1. Tearing of paper&lt;br&gt;2. Melting of ice&lt;br&gt;3. Folding of clothes | Only shape, size, or physical state changes; no new substance is formed; molecular composition remains identical. |</w:t>
+              <w:t>2. **Chemical change:** Rainwater and acids in the air react with minerals inside the rocks, breaking them down into new clay and rich soil minerals.</w:t>
               <w:br/>
             </w:r>
             <w:r>
               <w:rPr>
                 <w:rFonts w:ascii="Segoe UI" w:hAnsi="Segoe UI"/>
+                <w:b/>
                 <w:color w:val="334155"/>
                 <w:sz w:val="19"/>
               </w:rPr>
-              <w:t>| **Area B: Chemical Changes Only** | 1. Rusting of iron&lt;br&gt;2. Curdling of milk&lt;br&gt;3. Ripening of fruits&lt;br&gt;4. Burning of magnesium&lt;br&gt;5. Mixing baking soda with vinegar | New substances with entirely different chemical properties are produced; irreversible chemical reactions take place. |</w:t>
+              <w:t>- **తెలుగు వివరణ:**</w:t>
               <w:br/>
             </w:r>
             <w:r>
               <w:rPr>
                 <w:rFonts w:ascii="Segoe UI" w:hAnsi="Segoe UI"/>
+                <w:b/>
                 <w:color w:val="334155"/>
                 <w:sz w:val="19"/>
               </w:rPr>
-              <w:t>| **Area C: Both Physical &amp; Chemical Changes** | **Process of burning a candle** | **Physical:** Melting of solid wax to liquid and vaporisation.&lt;br&gt;**Chemical:** Combustion of wax vapour in oxygen to yield CO₂, H₂O, heat, and light. |</w:t>
+              <w:t>- నేల ఏర్పడటంలో **భౌతిక మరియు రసాయనిక మార్పులు రెండూ** ఉంటాయి.</w:t>
+              <w:br/>
+            </w:r>
+            <w:r>
+              <w:rPr>
+                <w:rFonts w:ascii="Segoe UI" w:hAnsi="Segoe UI"/>
+                <w:b/>
+                <w:color w:val="334155"/>
+                <w:sz w:val="19"/>
+              </w:rPr>
+              <w:t>- గాలి, నీటి ప్రవాహం రాళ్లను పగలగొట్టడం భౌతిక మార్పు; వర్షపు నీరు రాళ్లలోని ఖనిజాలతో చర్య జరిపి మట్టిగా మార్చడం రసాయనిక మార్పు.</w:t>
               <w:br/>
             </w:r>
           </w:p>
@@ -6219,7 +5814,17 @@
                 <w:color w:val="334155"/>
                 <w:sz w:val="19"/>
               </w:rPr>
-              <w:t>**Answer:** Adolescence is the transitional developmental period between childhood and adulthood, covering the age span of **11 to 19 years**.</w:t>
+              <w:t>**Answer:** Adolescence is the growing-up stage between childhood and adulthood. It covers the ages of **11 to 19 years** (the teenage years).</w:t>
+              <w:br/>
+            </w:r>
+            <w:r>
+              <w:rPr>
+                <w:rFonts w:ascii="Segoe UI" w:hAnsi="Segoe UI"/>
+                <w:b/>
+                <w:color w:val="334155"/>
+                <w:sz w:val="19"/>
+              </w:rPr>
+              <w:t>- **తెలుగు వివరణ:** కౌమారదశ అంటే బాల్యం నుండి యవ్వనానికి మారే ఎదుగుదల కాలం. ఇది **11 నుండి 19 సంవత్సరాల** మధ్య ఉంటుంది.</w:t>
               <w:br/>
             </w:r>
           </w:p>
@@ -6288,7 +5893,17 @@
                 <w:color w:val="334155"/>
                 <w:sz w:val="19"/>
               </w:rPr>
-              <w:t>**Answer:** Puberty is the physiological stage within adolescence during which sex organs mature and the human body becomes capable of sexual reproduction.</w:t>
+              <w:t>**Answer:** Puberty is the time during adolescence when the body physically matures and becomes capable of reproduction.</w:t>
+              <w:br/>
+            </w:r>
+            <w:r>
+              <w:rPr>
+                <w:rFonts w:ascii="Segoe UI" w:hAnsi="Segoe UI"/>
+                <w:b/>
+                <w:color w:val="334155"/>
+                <w:sz w:val="19"/>
+              </w:rPr>
+              <w:t>- **తెలుగు వివరణ:** కౌమారదశలో శరీరం పరిపక్వత చెంది ప్రత్యుత్పత్తికి సిద్ధమయ్యే సమయాన్ని 'ప్యూబర్టీ' (యవ్వనారంభం) అంటారు.</w:t>
               <w:br/>
             </w:r>
           </w:p>
@@ -6360,6 +5975,16 @@
               <w:t>**Answer:** **Testosterone** (in boys) and **Oestrogen** (in girls).</w:t>
               <w:br/>
             </w:r>
+            <w:r>
+              <w:rPr>
+                <w:rFonts w:ascii="Segoe UI" w:hAnsi="Segoe UI"/>
+                <w:b/>
+                <w:color w:val="334155"/>
+                <w:sz w:val="19"/>
+              </w:rPr>
+              <w:t>- **తెలుగు వివరణ:** అబ్బాయిలలో **టెస్టోస్టెరాన్**, అమ్మాయిలలో **ఈస్ట్రోజెన్** హార్మోన్లు మార్పులకు కారణం.</w:t>
+              <w:br/>
+            </w:r>
           </w:p>
         </w:tc>
       </w:tr>
@@ -6426,7 +6051,17 @@
                 <w:color w:val="334155"/>
                 <w:sz w:val="19"/>
               </w:rPr>
-              <w:t>**Answer:** Vitamin B12 is essential for healthy nerve tissue function, normal brain performance, and the production of healthy red blood cells (erythropoiesis).</w:t>
+              <w:t>**Answer:** Vitamin B12 helps in making healthy red blood cells and keeps the brain and nerves working properly.</w:t>
+              <w:br/>
+            </w:r>
+            <w:r>
+              <w:rPr>
+                <w:rFonts w:ascii="Segoe UI" w:hAnsi="Segoe UI"/>
+                <w:b/>
+                <w:color w:val="334155"/>
+                <w:sz w:val="19"/>
+              </w:rPr>
+              <w:t>- **తెలుగు వివరణ:** విటమిన్ B12 ఎర్ర రక్త కణాల తయారీకి మరియు నాడీ వ్యవస్థ సరిగ్గా పనిచేయడానికి సహాయపడుతుంది.</w:t>
               <w:br/>
             </w:r>
           </w:p>
@@ -6495,7 +6130,17 @@
                 <w:color w:val="334155"/>
                 <w:sz w:val="19"/>
               </w:rPr>
-              <w:t>**Answer:** Never share private personal information (passwords, phone numbers, home address, photos) with strangers online, and promptly report cyberbullying to trusted adults.</w:t>
+              <w:t>**Answer:** Never share private details (like passwords, phone numbers, or home address) with strangers online.</w:t>
+              <w:br/>
+            </w:r>
+            <w:r>
+              <w:rPr>
+                <w:rFonts w:ascii="Segoe UI" w:hAnsi="Segoe UI"/>
+                <w:b/>
+                <w:color w:val="334155"/>
+                <w:sz w:val="19"/>
+              </w:rPr>
+              <w:t>- **తెలుగు వివరణ:** ఇంటర్నెట్‌లో అపరిచితులతో పాస్‌వర్డ్‌లు, ఫోన్ నంబర్లు మరియు ఇంటి చిరునామా ఎప్పుడూ పంచుకోకూడదు.</w:t>
               <w:br/>
             </w:r>
           </w:p>
@@ -6526,7 +6171,7 @@
           <w:color w:val="0F766E"/>
           <w:sz w:val="22"/>
         </w:rPr>
-        <w:t>Section B: Answer the following questions briefly in three to four sentences:</w:t>
+        <w:t>Section B: Answer the following questions briefly in three to four sentences (Kid-Friendly &amp; Exam-Ready):</w:t>
       </w:r>
     </w:p>
     <w:p>
@@ -6599,7 +6244,7 @@
                 <w:color w:val="334155"/>
                 <w:sz w:val="19"/>
               </w:rPr>
-              <w:t>1. **Sudden Increase in Height (Growth Spurt):** Long bones of arms and legs elongate rapidly under growth hormones, changing body proportions.</w:t>
+              <w:t>1. **Sudden Increase in Height:** Arms and legs grow longer very rapidly during the growth spurt, making teenagers taller.</w:t>
               <w:br/>
             </w:r>
             <w:r>
@@ -6608,7 +6253,37 @@
                 <w:color w:val="334155"/>
                 <w:sz w:val="19"/>
               </w:rPr>
-              <w:t>2. **Development of Secondary Sexual Characteristics:** Boys develop facial hair and a deeper voice with an enlarged Adam's apple; girls develop breasts and experience widening of the pelvic girdle.</w:t>
+              <w:t>2. **Body and Voice Changes:** Boys develop facial hair and a deeper voice with a visible Adam's apple, while girls develop breasts and wider hips.</w:t>
+              <w:br/>
+            </w:r>
+            <w:r>
+              <w:rPr>
+                <w:rFonts w:ascii="Segoe UI" w:hAnsi="Segoe UI"/>
+                <w:b/>
+                <w:color w:val="334155"/>
+                <w:sz w:val="19"/>
+              </w:rPr>
+              <w:t>- **తెలుగు వివరణ:**</w:t>
+              <w:br/>
+            </w:r>
+            <w:r>
+              <w:rPr>
+                <w:rFonts w:ascii="Segoe UI" w:hAnsi="Segoe UI"/>
+                <w:b/>
+                <w:color w:val="334155"/>
+                <w:sz w:val="19"/>
+              </w:rPr>
+              <w:t>- 1. **ఎత్తు పెరగడం:** కాళ్లు, చేతుల ఎముకలు వేగంగా పెరిగి పిల్లలు చకచకా ఎత్తు పెరుగుతారు.</w:t>
+              <w:br/>
+            </w:r>
+            <w:r>
+              <w:rPr>
+                <w:rFonts w:ascii="Segoe UI" w:hAnsi="Segoe UI"/>
+                <w:b/>
+                <w:color w:val="334155"/>
+                <w:sz w:val="19"/>
+              </w:rPr>
+              <w:t>- 2. **శరీరంలో మార్పులు:** అబ్బాయిలలో మీసాలు రావడం, గొంతు మారడం జరుగుతుంది; అమ్మాయిలలో శరీర ఆకృతి మారుతుంది.</w:t>
               <w:br/>
             </w:r>
           </w:p>
@@ -6677,7 +6352,54 @@
                 <w:color w:val="334155"/>
                 <w:sz w:val="19"/>
               </w:rPr>
-              <w:t>**Answer:** Maintaining menstrual hygiene (changing sanitary napkins every 4–6 hours, using clean water, safe disposal) prevents hazardous bacterial infections of the reproductive and urinary tracts. Poor hygiene can cause severe pelvic inflammatory diseases and long-term health complications.</w:t>
+              <w:t>**Answer:**</w:t>
+              <w:br/>
+            </w:r>
+            <w:r>
+              <w:rPr>
+                <w:rFonts w:ascii="Segoe UI" w:hAnsi="Segoe UI"/>
+                <w:color w:val="334155"/>
+                <w:sz w:val="19"/>
+              </w:rPr>
+              <w:t>1. Good menstrual hygiene protects the body from harmful bacterial and fungal infections.</w:t>
+              <w:br/>
+            </w:r>
+            <w:r>
+              <w:rPr>
+                <w:rFonts w:ascii="Segoe UI" w:hAnsi="Segoe UI"/>
+                <w:color w:val="334155"/>
+                <w:sz w:val="19"/>
+              </w:rPr>
+              <w:t>2. Changing sanitary pads every 4 to 6 hours prevents rashes, itching, and unpleasant body odour.</w:t>
+              <w:br/>
+            </w:r>
+            <w:r>
+              <w:rPr>
+                <w:rFonts w:ascii="Segoe UI" w:hAnsi="Segoe UI"/>
+                <w:color w:val="334155"/>
+                <w:sz w:val="19"/>
+              </w:rPr>
+              <w:t>3. Staying clean helps girls feel comfortable, healthy, and confident during school and daily activities.</w:t>
+              <w:br/>
+            </w:r>
+            <w:r>
+              <w:rPr>
+                <w:rFonts w:ascii="Segoe UI" w:hAnsi="Segoe UI"/>
+                <w:b/>
+                <w:color w:val="334155"/>
+                <w:sz w:val="19"/>
+              </w:rPr>
+              <w:t>- **తెలుగు వివరణ:**</w:t>
+              <w:br/>
+            </w:r>
+            <w:r>
+              <w:rPr>
+                <w:rFonts w:ascii="Segoe UI" w:hAnsi="Segoe UI"/>
+                <w:b/>
+                <w:color w:val="334155"/>
+                <w:sz w:val="19"/>
+              </w:rPr>
+              <w:t>- పరిశుభ్రత పాటించడం వల్ల హానికరమైన ఇన్ఫెక్షన్లు రాకుండా ఉంటాయి. ప్రతి 4 నుండి 6 గంటలకు ప్యాడ్లు మార్చడం వల్ల ఆరోగ్యం, సౌకర్యం మరియు ఆత్మవిశ్వాసం లభిస్తాయి.</w:t>
               <w:br/>
             </w:r>
           </w:p>
@@ -6755,7 +6477,7 @@
                 <w:color w:val="334155"/>
                 <w:sz w:val="19"/>
               </w:rPr>
-              <w:t>1. **Developing Strong Assertiveness:** Learning to firmly say "NO" to peer pressure regarding drugs, alcohol, and tobacco.</w:t>
+              <w:t>1. **Learn to Say 'NO':** Firmly refuse if anyone or any friend pressures you to try cigarettes, tobacco, alcohol, or drugs.</w:t>
               <w:br/>
             </w:r>
             <w:r>
@@ -6764,7 +6486,46 @@
                 <w:color w:val="334155"/>
                 <w:sz w:val="19"/>
               </w:rPr>
-              <w:t>2. **Open Communication &amp; Healthy Outlets:** Seeking guidance from parents, counselors, and teachers when stressed, and channeling energy into sports, music, or creative arts.</w:t>
+              <w:t>2. **Talk to Trusted Adults:** Share your problems and feelings with parents or teachers instead of hiding stress.</w:t>
+              <w:br/>
+            </w:r>
+            <w:r>
+              <w:rPr>
+                <w:rFonts w:ascii="Segoe UI" w:hAnsi="Segoe UI"/>
+                <w:color w:val="334155"/>
+                <w:sz w:val="19"/>
+              </w:rPr>
+              <w:t>3. **Engage in Healthy Hobbies:** Spend your free time in sports, outdoor games, music, or art.</w:t>
+              <w:br/>
+            </w:r>
+            <w:r>
+              <w:rPr>
+                <w:rFonts w:ascii="Segoe UI" w:hAnsi="Segoe UI"/>
+                <w:b/>
+                <w:color w:val="334155"/>
+                <w:sz w:val="19"/>
+              </w:rPr>
+              <w:t>- **తెలుగు వివరణ:**</w:t>
+              <w:br/>
+            </w:r>
+            <w:r>
+              <w:rPr>
+                <w:rFonts w:ascii="Segoe UI" w:hAnsi="Segoe UI"/>
+                <w:b/>
+                <w:color w:val="334155"/>
+                <w:sz w:val="19"/>
+              </w:rPr>
+              <w:t>- 1. స్నేహితులు ఒత్తిడి తెచ్చినా ధైర్యంగా 'వద్దు (NO)' అని చెప్పడం నేర్చుకోవాలి.</w:t>
+              <w:br/>
+            </w:r>
+            <w:r>
+              <w:rPr>
+                <w:rFonts w:ascii="Segoe UI" w:hAnsi="Segoe UI"/>
+                <w:b/>
+                <w:color w:val="334155"/>
+                <w:sz w:val="19"/>
+              </w:rPr>
+              <w:t>- 2. ఒత్తిడిగా అనిపించినప్పుడు తల్లిదండ్రులు లేదా ఉపాధ్యాయులతో మాట్లాడాలి. ఆటలు, హాబీలలో సమయం గడపాలి.</w:t>
               <w:br/>
             </w:r>
           </w:p>
@@ -6833,7 +6594,63 @@
                 <w:color w:val="334155"/>
                 <w:sz w:val="19"/>
               </w:rPr>
-              <w:t>**Answer:** Because rapid cellular replication, tissue synthesis, and bone ossification take place during adolescence, a balanced diet provides proteins for muscle growth, calcium for bone density, carbohydrates for daily metabolic energy, and iron for building blood haemoglobin. Without proper nutrients, stunted growth, fatigue, and anaemia can occur.</w:t>
+              <w:t>**Answer:**</w:t>
+              <w:br/>
+            </w:r>
+            <w:r>
+              <w:rPr>
+                <w:rFonts w:ascii="Segoe UI" w:hAnsi="Segoe UI"/>
+                <w:color w:val="334155"/>
+                <w:sz w:val="19"/>
+              </w:rPr>
+              <w:t>1. Teenagers grow very fast and need a lot of energy and healthy food every day.</w:t>
+              <w:br/>
+            </w:r>
+            <w:r>
+              <w:rPr>
+                <w:rFonts w:ascii="Segoe UI" w:hAnsi="Segoe UI"/>
+                <w:color w:val="334155"/>
+                <w:sz w:val="19"/>
+              </w:rPr>
+              <w:t>2. **Proteins** (pulses, milk, eggs) build strong muscles, while **Calcium** makes bones grow long and tough.</w:t>
+              <w:br/>
+            </w:r>
+            <w:r>
+              <w:rPr>
+                <w:rFonts w:ascii="Segoe UI" w:hAnsi="Segoe UI"/>
+                <w:color w:val="334155"/>
+                <w:sz w:val="19"/>
+              </w:rPr>
+              <w:t>3. **Iron** (leafy vegetables, jaggery) builds healthy blood and prevents tiredness (anaemia).</w:t>
+              <w:br/>
+            </w:r>
+            <w:r>
+              <w:rPr>
+                <w:rFonts w:ascii="Segoe UI" w:hAnsi="Segoe UI"/>
+                <w:color w:val="334155"/>
+                <w:sz w:val="19"/>
+              </w:rPr>
+              <w:t>4. Eating a balanced diet keeps teenagers energetic, fit, and mentally sharp.</w:t>
+              <w:br/>
+            </w:r>
+            <w:r>
+              <w:rPr>
+                <w:rFonts w:ascii="Segoe UI" w:hAnsi="Segoe UI"/>
+                <w:b/>
+                <w:color w:val="334155"/>
+                <w:sz w:val="19"/>
+              </w:rPr>
+              <w:t>- **తెలుగు వివరణ:**</w:t>
+              <w:br/>
+            </w:r>
+            <w:r>
+              <w:rPr>
+                <w:rFonts w:ascii="Segoe UI" w:hAnsi="Segoe UI"/>
+                <w:b/>
+                <w:color w:val="334155"/>
+                <w:sz w:val="19"/>
+              </w:rPr>
+              <w:t>- కౌమారదశలో శరీరం వేగంగా పెరుగుతుంది కాబట్టి పౌష్టికాహారం చాలా అవసరం. పాలు, పప్పులు కండరాలను బలంగా చేస్తాయి; కాల్షియం ఎముకలను దృఢపరుస్తుంది; ఆకుకూరలలోని ఐరన్ రక్తాన్ని పెంచి నీరసం రాకుండా కాపాడుతుంది.</w:t>
               <w:br/>
             </w:r>
           </w:p>
@@ -6902,7 +6719,7 @@
                 <w:color w:val="334155"/>
                 <w:sz w:val="19"/>
               </w:rPr>
-              <w:t>**Answer:** In addition to mood swings, adolescents often exhibit:</w:t>
+              <w:t>**Answer:**</w:t>
               <w:br/>
             </w:r>
             <w:r>
@@ -6911,7 +6728,7 @@
                 <w:color w:val="334155"/>
                 <w:sz w:val="19"/>
               </w:rPr>
-              <w:t>1. Heightened self-consciousness and preoccupation with physical appearance.</w:t>
+              <w:t>Apart from mood swings, teenagers often show these natural behavioural changes:</w:t>
               <w:br/>
             </w:r>
             <w:r>
@@ -6920,7 +6737,7 @@
                 <w:color w:val="334155"/>
                 <w:sz w:val="19"/>
               </w:rPr>
-              <w:t>2. A strong drive for independence and peer acceptance, occasionally clashing with parental authority.</w:t>
+              <w:t>1. **Caring About Looks:** They pay more attention to their clothes, hairstyles, and physical appearance.</w:t>
               <w:br/>
             </w:r>
             <w:r>
@@ -6929,93 +6746,7 @@
                 <w:color w:val="334155"/>
                 <w:sz w:val="19"/>
               </w:rPr>
-              <w:t>3. Increased emotional sensitivity, curiosity, and abstract intellectual thinking.</w:t>
-              <w:br/>
-            </w:r>
-          </w:p>
-        </w:tc>
-      </w:tr>
-    </w:tbl>
-    <w:p/>
-    <w:p>
-      <w:pPr>
-        <w:spacing w:before="80" w:after="80"/>
-      </w:pPr>
-      <w:r>
-        <w:rPr>
-          <w:color w:val="CBD5E1"/>
-          <w:sz w:val="16"/>
-        </w:rPr>
-        <w:t>_______________________________________________________________________________</w:t>
-      </w:r>
-    </w:p>
-    <w:p>
-      <w:pPr>
-        <w:spacing w:before="200" w:after="60"/>
-      </w:pPr>
-      <w:r>
-        <w:rPr>
-          <w:rFonts w:ascii="Segoe UI" w:hAnsi="Segoe UI"/>
-          <w:b/>
-          <w:color w:val="0F766E"/>
-          <w:sz w:val="22"/>
-        </w:rPr>
-        <w:t>Section C: Answer the following questions in five to seven complete sentences:</w:t>
-      </w:r>
-    </w:p>
-    <w:p>
-      <w:pPr>
-        <w:spacing w:before="40" w:after="40" w:line="276" w:lineRule="auto"/>
-      </w:pPr>
-      <w:r>
-        <w:rPr>
-          <w:rFonts w:ascii="Segoe UI" w:hAnsi="Segoe UI"/>
-          <w:color w:val="1E293B"/>
-          <w:sz w:val="20"/>
-        </w:rPr>
-        <w:t>**Q1. How do hormones influence puberty and physical growth during adolescence?**</w:t>
-      </w:r>
-    </w:p>
-    <w:tbl>
-      <w:tblPr>
-        <w:tblW w:type="auto" w:w="0"/>
-        <w:jc w:val="center"/>
-        <w:tblLayout w:type="fixed"/>
-        <w:tblLook w:firstColumn="1" w:firstRow="1" w:lastColumn="0" w:lastRow="0" w:noHBand="0" w:noVBand="1" w:val="04A0"/>
-      </w:tblPr>
-      <w:tblGrid>
-        <w:gridCol w:w="10080"/>
-      </w:tblGrid>
-      <w:tr>
-        <w:tc>
-          <w:tcPr>
-            <w:tcW w:type="dxa" w:w="9360"/>
-            <w:shd w:fill="F0F9FF"/>
-            <w:tcMar>
-              <w:top w:w="120" w:type="dxa"/>
-              <w:bottom w:w="120" w:type="dxa"/>
-              <w:left w:w="180" w:type="dxa"/>
-              <w:right w:w="140" w:type="dxa"/>
-            </w:tcMar>
-            <w:tcBorders>
-              <w:top w:val="none"/>
-              <w:left w:val="single" w:sz="24" w:space="0" w:color="0284C7"/>
-              <w:bottom w:val="none"/>
-              <w:right w:val="none"/>
-            </w:tcBorders>
-          </w:tcPr>
-          <w:p>
-            <w:pPr>
-              <w:spacing w:before="40" w:after="40" w:line="276" w:lineRule="auto"/>
-            </w:pPr>
-            <w:r>
-              <w:rPr>
-                <w:rFonts w:ascii="Segoe UI" w:hAnsi="Segoe UI"/>
-                <w:b/>
-                <w:color w:val="1E3A8A"/>
-                <w:sz w:val="20"/>
-              </w:rPr>
-              <w:t>Curriculum Overview / Key Scientific Fact</w:t>
+              <w:t>2. **Focusing on Friends:** They enjoy spending time with friends and value their friends' opinions.</w:t>
               <w:br/>
             </w:r>
             <w:r>
@@ -7024,7 +6755,16 @@
                 <w:color w:val="334155"/>
                 <w:sz w:val="19"/>
               </w:rPr>
-              <w:t>**Answer:**</w:t>
+              <w:t>3. **Wanting Independence:** They like to make their own choices and do things on their own.</w:t>
+              <w:br/>
+            </w:r>
+            <w:r>
+              <w:rPr>
+                <w:rFonts w:ascii="Segoe UI" w:hAnsi="Segoe UI"/>
+                <w:color w:val="334155"/>
+                <w:sz w:val="19"/>
+              </w:rPr>
+              <w:t>4. **Deeper Thinking:** They start thinking more about their future goals, hobbies, and ideas.</w:t>
               <w:br/>
             </w:r>
             <w:r>
@@ -7034,7 +6774,7 @@
                 <w:color w:val="334155"/>
                 <w:sz w:val="19"/>
               </w:rPr>
-              <w:t>- Hormones act as biochemical signaling molecules that orchestrate the onset of puberty.</w:t>
+              <w:t>- **తెలుగు వివరణ:**</w:t>
               <w:br/>
             </w:r>
             <w:r>
@@ -7044,508 +6784,7 @@
                 <w:color w:val="334155"/>
                 <w:sz w:val="19"/>
               </w:rPr>
-              <w:t>- The pituitary gland (master gland) secretes follicle-stimulating hormone (FSH) and luteinizing hormone (LH), which instruct the testes in boys to produce **testosterone** and the ovaries in girls to produce **oestrogen**.</w:t>
-              <w:br/>
-            </w:r>
-            <w:r>
-              <w:rPr>
-                <w:rFonts w:ascii="Segoe UI" w:hAnsi="Segoe UI"/>
-                <w:b/>
-                <w:color w:val="334155"/>
-                <w:sz w:val="19"/>
-              </w:rPr>
-              <w:t>- Testosterone triggers facial hair growth, muscular broadening of shoulders, deepening of the voice, and sperm production.</w:t>
-              <w:br/>
-            </w:r>
-            <w:r>
-              <w:rPr>
-                <w:rFonts w:ascii="Segoe UI" w:hAnsi="Segoe UI"/>
-                <w:b/>
-                <w:color w:val="334155"/>
-                <w:sz w:val="19"/>
-              </w:rPr>
-              <w:t>- Oestrogen stimulates breast tissue enlargement, widening of pelvic bones, and the commencement of ovulation and the menstrual cycle.</w:t>
-              <w:br/>
-            </w:r>
-            <w:r>
-              <w:rPr>
-                <w:rFonts w:ascii="Segoe UI" w:hAnsi="Segoe UI"/>
-                <w:b/>
-                <w:color w:val="334155"/>
-                <w:sz w:val="19"/>
-              </w:rPr>
-              <w:t>- Simultaneously, pituitary growth hormone promotes bone and tissue elongation, creating the characteristic adolescent growth spurt.</w:t>
-              <w:br/>
-            </w:r>
-          </w:p>
-        </w:tc>
-      </w:tr>
-    </w:tbl>
-    <w:p/>
-    <w:p>
-      <w:pPr>
-        <w:spacing w:before="40" w:after="40" w:line="276" w:lineRule="auto"/>
-      </w:pPr>
-      <w:r>
-        <w:rPr>
-          <w:rFonts w:ascii="Segoe UI" w:hAnsi="Segoe UI"/>
-          <w:color w:val="1E293B"/>
-          <w:sz w:val="20"/>
-        </w:rPr>
-        <w:t>**Q2. Describe the emotional and behavioural changes commonly seen during adolescence.**</w:t>
-      </w:r>
-    </w:p>
-    <w:tbl>
-      <w:tblPr>
-        <w:tblW w:type="auto" w:w="0"/>
-        <w:jc w:val="center"/>
-        <w:tblLayout w:type="fixed"/>
-        <w:tblLook w:firstColumn="1" w:firstRow="1" w:lastColumn="0" w:lastRow="0" w:noHBand="0" w:noVBand="1" w:val="04A0"/>
-      </w:tblPr>
-      <w:tblGrid>
-        <w:gridCol w:w="10080"/>
-      </w:tblGrid>
-      <w:tr>
-        <w:tc>
-          <w:tcPr>
-            <w:tcW w:type="dxa" w:w="9360"/>
-            <w:shd w:fill="F0F9FF"/>
-            <w:tcMar>
-              <w:top w:w="120" w:type="dxa"/>
-              <w:bottom w:w="120" w:type="dxa"/>
-              <w:left w:w="180" w:type="dxa"/>
-              <w:right w:w="140" w:type="dxa"/>
-            </w:tcMar>
-            <w:tcBorders>
-              <w:top w:val="none"/>
-              <w:left w:val="single" w:sz="24" w:space="0" w:color="0284C7"/>
-              <w:bottom w:val="none"/>
-              <w:right w:val="none"/>
-            </w:tcBorders>
-          </w:tcPr>
-          <w:p>
-            <w:pPr>
-              <w:spacing w:before="40" w:after="40" w:line="276" w:lineRule="auto"/>
-            </w:pPr>
-            <w:r>
-              <w:rPr>
-                <w:rFonts w:ascii="Segoe UI" w:hAnsi="Segoe UI"/>
-                <w:b/>
-                <w:color w:val="1E3A8A"/>
-                <w:sz w:val="20"/>
-              </w:rPr>
-              <w:t>Curriculum Overview / Key Scientific Fact</w:t>
-              <w:br/>
-            </w:r>
-            <w:r>
-              <w:rPr>
-                <w:rFonts w:ascii="Segoe UI" w:hAnsi="Segoe UI"/>
-                <w:color w:val="334155"/>
-                <w:sz w:val="19"/>
-              </w:rPr>
-              <w:t>**Answer:**</w:t>
-              <w:br/>
-            </w:r>
-            <w:r>
-              <w:rPr>
-                <w:rFonts w:ascii="Segoe UI" w:hAnsi="Segoe UI"/>
-                <w:b/>
-                <w:color w:val="334155"/>
-                <w:sz w:val="19"/>
-              </w:rPr>
-              <w:t>- Rapid hormonal surges directly interact with brain neurotransmitters, resulting in frequent emotional fluctuations or mood swings.</w:t>
-              <w:br/>
-            </w:r>
-            <w:r>
-              <w:rPr>
-                <w:rFonts w:ascii="Segoe UI" w:hAnsi="Segoe UI"/>
-                <w:b/>
-                <w:color w:val="334155"/>
-                <w:sz w:val="19"/>
-              </w:rPr>
-              <w:t>- Adolescents shift from childlike dependence toward establishing a distinct personal identity and seeking autonomy from adults.</w:t>
-              <w:br/>
-            </w:r>
-            <w:r>
-              <w:rPr>
-                <w:rFonts w:ascii="Segoe UI" w:hAnsi="Segoe UI"/>
-                <w:b/>
-                <w:color w:val="334155"/>
-                <w:sz w:val="19"/>
-              </w:rPr>
-              <w:t>- Peer relationships and social acceptance assume dominant importance, making adolescents sensitive to peer opinions and peer pressure.</w:t>
-              <w:br/>
-            </w:r>
-            <w:r>
-              <w:rPr>
-                <w:rFonts w:ascii="Segoe UI" w:hAnsi="Segoe UI"/>
-                <w:b/>
-                <w:color w:val="334155"/>
-                <w:sz w:val="19"/>
-              </w:rPr>
-              <w:t>- Cognitive capacity expands into abstract reasoning, critical thinking, idealism, and intense curiosity about the future.</w:t>
-              <w:br/>
-            </w:r>
-            <w:r>
-              <w:rPr>
-                <w:rFonts w:ascii="Segoe UI" w:hAnsi="Segoe UI"/>
-                <w:b/>
-                <w:color w:val="334155"/>
-                <w:sz w:val="19"/>
-              </w:rPr>
-              <w:t>- Insecurity or self-doubt regarding physical body changes and acne may arise, requiring empathetic reassurance and emotional support.</w:t>
-              <w:br/>
-            </w:r>
-          </w:p>
-        </w:tc>
-      </w:tr>
-    </w:tbl>
-    <w:p/>
-    <w:p>
-      <w:pPr>
-        <w:spacing w:before="40" w:after="40" w:line="276" w:lineRule="auto"/>
-      </w:pPr>
-      <w:r>
-        <w:rPr>
-          <w:rFonts w:ascii="Segoe UI" w:hAnsi="Segoe UI"/>
-          <w:color w:val="1E293B"/>
-          <w:sz w:val="20"/>
-        </w:rPr>
-        <w:t>**Q3. How can adolescents ensure their safety and positivity while using the internet?**</w:t>
-      </w:r>
-    </w:p>
-    <w:tbl>
-      <w:tblPr>
-        <w:tblW w:type="auto" w:w="0"/>
-        <w:jc w:val="center"/>
-        <w:tblLayout w:type="fixed"/>
-        <w:tblLook w:firstColumn="1" w:firstRow="1" w:lastColumn="0" w:lastRow="0" w:noHBand="0" w:noVBand="1" w:val="04A0"/>
-      </w:tblPr>
-      <w:tblGrid>
-        <w:gridCol w:w="10080"/>
-      </w:tblGrid>
-      <w:tr>
-        <w:tc>
-          <w:tcPr>
-            <w:tcW w:type="dxa" w:w="9360"/>
-            <w:shd w:fill="F0F9FF"/>
-            <w:tcMar>
-              <w:top w:w="120" w:type="dxa"/>
-              <w:bottom w:w="120" w:type="dxa"/>
-              <w:left w:w="180" w:type="dxa"/>
-              <w:right w:w="140" w:type="dxa"/>
-            </w:tcMar>
-            <w:tcBorders>
-              <w:top w:val="none"/>
-              <w:left w:val="single" w:sz="24" w:space="0" w:color="0284C7"/>
-              <w:bottom w:val="none"/>
-              <w:right w:val="none"/>
-            </w:tcBorders>
-          </w:tcPr>
-          <w:p>
-            <w:pPr>
-              <w:spacing w:before="40" w:after="40" w:line="276" w:lineRule="auto"/>
-            </w:pPr>
-            <w:r>
-              <w:rPr>
-                <w:rFonts w:ascii="Segoe UI" w:hAnsi="Segoe UI"/>
-                <w:b/>
-                <w:color w:val="1E3A8A"/>
-                <w:sz w:val="20"/>
-              </w:rPr>
-              <w:t>Curriculum Overview / Key Scientific Fact</w:t>
-              <w:br/>
-            </w:r>
-            <w:r>
-              <w:rPr>
-                <w:rFonts w:ascii="Segoe UI" w:hAnsi="Segoe UI"/>
-                <w:color w:val="334155"/>
-                <w:sz w:val="19"/>
-              </w:rPr>
-              <w:t>**Answer:**</w:t>
-              <w:br/>
-            </w:r>
-            <w:r>
-              <w:rPr>
-                <w:rFonts w:ascii="Segoe UI" w:hAnsi="Segoe UI"/>
-                <w:b/>
-                <w:color w:val="334155"/>
-                <w:sz w:val="19"/>
-              </w:rPr>
-              <w:t>- Practice strict digital privacy by setting social media accounts to private and never sharing sensitive information such as home addresses, school names, passwords, or personal financial details.</w:t>
-              <w:br/>
-            </w:r>
-            <w:r>
-              <w:rPr>
-                <w:rFonts w:ascii="Segoe UI" w:hAnsi="Segoe UI"/>
-                <w:b/>
-                <w:color w:val="334155"/>
-                <w:sz w:val="19"/>
-              </w:rPr>
-              <w:t>- Interact online only with verified, known friends and family members; avoid accepting friend requests or arranging in-person meetings with online strangers.</w:t>
-              <w:br/>
-            </w:r>
-            <w:r>
-              <w:rPr>
-                <w:rFonts w:ascii="Segoe UI" w:hAnsi="Segoe UI"/>
-                <w:b/>
-                <w:color w:val="334155"/>
-                <w:sz w:val="19"/>
-              </w:rPr>
-              <w:t>- Be polite and respectful in online conversations; never participate in trolling, derogatory comments, or forwarding unverified rumors.</w:t>
-              <w:br/>
-            </w:r>
-            <w:r>
-              <w:rPr>
-                <w:rFonts w:ascii="Segoe UI" w:hAnsi="Segoe UI"/>
-                <w:b/>
-                <w:color w:val="334155"/>
-                <w:sz w:val="19"/>
-              </w:rPr>
-              <w:t>- If subjected to cyberbullying or inappropriate content, take screenshots as evidence, block the perpetrator, and immediately inform parents or teachers.</w:t>
-              <w:br/>
-            </w:r>
-            <w:r>
-              <w:rPr>
-                <w:rFonts w:ascii="Segoe UI" w:hAnsi="Segoe UI"/>
-                <w:b/>
-                <w:color w:val="334155"/>
-                <w:sz w:val="19"/>
-              </w:rPr>
-              <w:t>- Set healthy screen-time limits to safeguard sleep quality, physical activity, and mental peace.</w:t>
-              <w:br/>
-            </w:r>
-          </w:p>
-        </w:tc>
-      </w:tr>
-    </w:tbl>
-    <w:p/>
-    <w:p>
-      <w:pPr>
-        <w:spacing w:before="40" w:after="40" w:line="276" w:lineRule="auto"/>
-      </w:pPr>
-      <w:r>
-        <w:rPr>
-          <w:rFonts w:ascii="Segoe UI" w:hAnsi="Segoe UI"/>
-          <w:color w:val="1E293B"/>
-          <w:sz w:val="20"/>
-        </w:rPr>
-        <w:t>**Q4. Why is it essential for teenagers to avoid drugs and alcohol?**</w:t>
-      </w:r>
-    </w:p>
-    <w:tbl>
-      <w:tblPr>
-        <w:tblW w:type="auto" w:w="0"/>
-        <w:jc w:val="center"/>
-        <w:tblLayout w:type="fixed"/>
-        <w:tblLook w:firstColumn="1" w:firstRow="1" w:lastColumn="0" w:lastRow="0" w:noHBand="0" w:noVBand="1" w:val="04A0"/>
-      </w:tblPr>
-      <w:tblGrid>
-        <w:gridCol w:w="10080"/>
-      </w:tblGrid>
-      <w:tr>
-        <w:tc>
-          <w:tcPr>
-            <w:tcW w:type="dxa" w:w="9360"/>
-            <w:shd w:fill="F0F9FF"/>
-            <w:tcMar>
-              <w:top w:w="120" w:type="dxa"/>
-              <w:bottom w:w="120" w:type="dxa"/>
-              <w:left w:w="180" w:type="dxa"/>
-              <w:right w:w="140" w:type="dxa"/>
-            </w:tcMar>
-            <w:tcBorders>
-              <w:top w:val="none"/>
-              <w:left w:val="single" w:sz="24" w:space="0" w:color="0284C7"/>
-              <w:bottom w:val="none"/>
-              <w:right w:val="none"/>
-            </w:tcBorders>
-          </w:tcPr>
-          <w:p>
-            <w:pPr>
-              <w:spacing w:before="40" w:after="40" w:line="276" w:lineRule="auto"/>
-            </w:pPr>
-            <w:r>
-              <w:rPr>
-                <w:rFonts w:ascii="Segoe UI" w:hAnsi="Segoe UI"/>
-                <w:b/>
-                <w:color w:val="1E3A8A"/>
-                <w:sz w:val="20"/>
-              </w:rPr>
-              <w:t>Curriculum Overview / Key Scientific Fact</w:t>
-              <w:br/>
-            </w:r>
-            <w:r>
-              <w:rPr>
-                <w:rFonts w:ascii="Segoe UI" w:hAnsi="Segoe UI"/>
-                <w:color w:val="334155"/>
-                <w:sz w:val="19"/>
-              </w:rPr>
-              <w:t>**Answer:**</w:t>
-              <w:br/>
-            </w:r>
-            <w:r>
-              <w:rPr>
-                <w:rFonts w:ascii="Segoe UI" w:hAnsi="Segoe UI"/>
-                <w:b/>
-                <w:color w:val="334155"/>
-                <w:sz w:val="19"/>
-              </w:rPr>
-              <w:t>- The adolescent brain is actively developing neural pathways for reasoning, judgment, and emotional regulation; addictive substances permanently impair cognitive faculties and memory.</w:t>
-              <w:br/>
-            </w:r>
-            <w:r>
-              <w:rPr>
-                <w:rFonts w:ascii="Segoe UI" w:hAnsi="Segoe UI"/>
-                <w:b/>
-                <w:color w:val="334155"/>
-                <w:sz w:val="19"/>
-              </w:rPr>
-              <w:t>- Drugs, tobacco (nicotine), and alcohol are highly addictive, trapping young individuals in cycles of dependence, severe financial distress, and criminal jeopardy.</w:t>
-              <w:br/>
-            </w:r>
-            <w:r>
-              <w:rPr>
-                <w:rFonts w:ascii="Segoe UI" w:hAnsi="Segoe UI"/>
-                <w:b/>
-                <w:color w:val="334155"/>
-                <w:sz w:val="19"/>
-              </w:rPr>
-              <w:t>- Chronic alcohol consumption causes severe liver cirrhosis and cardiovascular dysfunction; tobacco smoking irreversibly damages lungs, causing chronic respiratory diseases and lung cancer.</w:t>
-              <w:br/>
-            </w:r>
-            <w:r>
-              <w:rPr>
-                <w:rFonts w:ascii="Segoe UI" w:hAnsi="Segoe UI"/>
-                <w:b/>
-                <w:color w:val="334155"/>
-                <w:sz w:val="19"/>
-              </w:rPr>
-              <w:t>- Substance abuse ruins academic performance, strains family relationships, and induces severe psychiatric disorders such as depression, anxiety, and psychosis.</w:t>
-              <w:br/>
-            </w:r>
-            <w:r>
-              <w:rPr>
-                <w:rFonts w:ascii="Segoe UI" w:hAnsi="Segoe UI"/>
-                <w:b/>
-                <w:color w:val="334155"/>
-                <w:sz w:val="19"/>
-              </w:rPr>
-              <w:t>- The government's **Nasha Mukt Bharat Abhiyaan** emphasizes building a resilient, drug-free youth community to safeguard national progress.</w:t>
-              <w:br/>
-            </w:r>
-          </w:p>
-        </w:tc>
-      </w:tr>
-    </w:tbl>
-    <w:p/>
-    <w:p>
-      <w:pPr>
-        <w:spacing w:before="40" w:after="40" w:line="276" w:lineRule="auto"/>
-      </w:pPr>
-      <w:r>
-        <w:rPr>
-          <w:rFonts w:ascii="Segoe UI" w:hAnsi="Segoe UI"/>
-          <w:color w:val="1E293B"/>
-          <w:sz w:val="20"/>
-        </w:rPr>
-        <w:t>**Q5. Categorisation Table: Physical changes during adolescence:**</w:t>
-      </w:r>
-    </w:p>
-    <w:tbl>
-      <w:tblPr>
-        <w:tblW w:type="auto" w:w="0"/>
-        <w:jc w:val="center"/>
-        <w:tblLayout w:type="fixed"/>
-        <w:tblLook w:firstColumn="1" w:firstRow="1" w:lastColumn="0" w:lastRow="0" w:noHBand="0" w:noVBand="1" w:val="04A0"/>
-      </w:tblPr>
-      <w:tblGrid>
-        <w:gridCol w:w="10080"/>
-      </w:tblGrid>
-      <w:tr>
-        <w:tc>
-          <w:tcPr>
-            <w:tcW w:type="dxa" w:w="9360"/>
-            <w:shd w:fill="F0F9FF"/>
-            <w:tcMar>
-              <w:top w:w="120" w:type="dxa"/>
-              <w:bottom w:w="120" w:type="dxa"/>
-              <w:left w:w="180" w:type="dxa"/>
-              <w:right w:w="140" w:type="dxa"/>
-            </w:tcMar>
-            <w:tcBorders>
-              <w:top w:val="none"/>
-              <w:left w:val="single" w:sz="24" w:space="0" w:color="0284C7"/>
-              <w:bottom w:val="none"/>
-              <w:right w:val="none"/>
-            </w:tcBorders>
-          </w:tcPr>
-          <w:p>
-            <w:pPr>
-              <w:spacing w:before="40" w:after="40" w:line="276" w:lineRule="auto"/>
-            </w:pPr>
-            <w:r>
-              <w:rPr>
-                <w:rFonts w:ascii="Segoe UI" w:hAnsi="Segoe UI"/>
-                <w:b/>
-                <w:color w:val="1E3A8A"/>
-                <w:sz w:val="20"/>
-              </w:rPr>
-              <w:t>Curriculum Overview / Key Scientific Fact</w:t>
-              <w:br/>
-            </w:r>
-            <w:r>
-              <w:rPr>
-                <w:rFonts w:ascii="Segoe UI" w:hAnsi="Segoe UI"/>
-                <w:color w:val="334155"/>
-                <w:sz w:val="19"/>
-              </w:rPr>
-              <w:t>*(i) Change in voice, (ii) Development of breasts, (iii) Growth of moustache, (iv) Growth of facial hair, (v) Pimples on the face, (vi) Growth of hair in the pubic region, (vii) Growth of hair in armpits.*</w:t>
-              <w:br/>
-            </w:r>
-            <w:r>
-              <w:rPr>
-                <w:rFonts w:ascii="Segoe UI" w:hAnsi="Segoe UI"/>
-                <w:color w:val="334155"/>
-                <w:sz w:val="19"/>
-              </w:rPr>
-              <w:t>| Category | Changes Occurring |</w:t>
-              <w:br/>
-            </w:r>
-            <w:r>
-              <w:rPr>
-                <w:rFonts w:ascii="Segoe UI" w:hAnsi="Segoe UI"/>
-                <w:color w:val="334155"/>
-                <w:sz w:val="19"/>
-              </w:rPr>
-              <w:t>| :--- | :--- |</w:t>
-              <w:br/>
-            </w:r>
-            <w:r>
-              <w:rPr>
-                <w:rFonts w:ascii="Segoe UI" w:hAnsi="Segoe UI"/>
-                <w:color w:val="334155"/>
-                <w:sz w:val="19"/>
-              </w:rPr>
-              <w:t>| **Changes Exclusive to Boys** | • Growth of moustache&lt;br&gt;• Growth of facial hair (beard)&lt;br&gt;• Significant deepening of voice (Adam's apple enlargement) |</w:t>
-              <w:br/>
-            </w:r>
-            <w:r>
-              <w:rPr>
-                <w:rFonts w:ascii="Segoe UI" w:hAnsi="Segoe UI"/>
-                <w:color w:val="334155"/>
-                <w:sz w:val="19"/>
-              </w:rPr>
-              <w:t>| **Changes Exclusive to Girls** | • Development of breasts (mammary glands)&lt;br&gt;• Beginning of menstrual cycle (menarche) |</w:t>
-              <w:br/>
-            </w:r>
-            <w:r>
-              <w:rPr>
-                <w:rFonts w:ascii="Segoe UI" w:hAnsi="Segoe UI"/>
-                <w:color w:val="334155"/>
-                <w:sz w:val="19"/>
-              </w:rPr>
-              <w:t>| **Changes Common to Both Boys &amp; Girls** | • Growth of hair in armpits&lt;br&gt;• Growth of hair in the pubic region&lt;br&gt;• Pimples/acne on face due to active oil glands&lt;br&gt;• Rapid increase in height (growth spurt) |</w:t>
+              <w:t>- మానసిక మార్పులతో పాటు టీనేజర్లు తమ రూపం మరియు దుస్తులపై ఎక్కువ శ్రద్ధ పెడతారు, స్నేహితులతో ఎక్కువ సమయం గడపడానికి ఇష్టపడతారు, మరియు స్వతంత్రంగా ఆలోచించడం ప్రారంభిస్తారు. ఇవన్నీ ఎదుగుదలలో అత్యంత సహజమైన మార్పులు.</w:t>
               <w:br/>
             </w:r>
           </w:p>

</xml_diff>